<commit_message>
changed name of licence check file
</commit_message>
<xml_diff>
--- a/docs/Technical Report.docx
+++ b/docs/Technical Report.docx
@@ -944,332 +944,1262 @@
         <w:t>Comparison with Existing Solutions:</w:t>
       </w:r>
     </w:p>
-    <w:p>
-      <w:pPr>
-        <w:rPr>
-          <w:rFonts w:ascii="Century Gothic" w:hAnsi="Century Gothic"/>
-        </w:rPr>
-      </w:pPr>
-    </w:p>
-    <w:p>
-      <w:pPr>
-        <w:rPr>
-          <w:rFonts w:ascii="Century Gothic" w:hAnsi="Century Gothic"/>
-        </w:rPr>
-      </w:pPr>
-      <w:r>
-        <w:rPr>
-          <w:rFonts w:ascii="Century Gothic" w:hAnsi="Century Gothic"/>
-        </w:rPr>
-        <w:t xml:space="preserve">| Metric | Traditional Lab | Perennial | </w:t>
+    <w:tbl>
+      <w:tblPr>
+        <w:tblStyle w:val="GridTable4-Accent6"/>
+        <w:tblW w:w="11011" w:type="dxa"/>
+        <w:tblInd w:w="-903" w:type="dxa"/>
+        <w:tblLook w:val="04A0" w:firstRow="1" w:lastRow="0" w:firstColumn="1" w:lastColumn="0" w:noHBand="0" w:noVBand="1"/>
+      </w:tblPr>
+      <w:tblGrid>
+        <w:gridCol w:w="2201"/>
+        <w:gridCol w:w="2201"/>
+        <w:gridCol w:w="2200"/>
+        <w:gridCol w:w="2201"/>
+        <w:gridCol w:w="2208"/>
+      </w:tblGrid>
+      <w:tr>
+        <w:trPr>
+          <w:cnfStyle w:val="100000000000" w:firstRow="1" w:lastRow="0" w:firstColumn="0" w:lastColumn="0" w:oddVBand="0" w:evenVBand="0" w:oddHBand="0" w:evenHBand="0" w:firstRowFirstColumn="0" w:firstRowLastColumn="0" w:lastRowFirstColumn="0" w:lastRowLastColumn="0"/>
+          <w:trHeight w:val="530"/>
+        </w:trPr>
+        <w:tc>
+          <w:tcPr>
+            <w:cnfStyle w:val="001000000000" w:firstRow="0" w:lastRow="0" w:firstColumn="1" w:lastColumn="0" w:oddVBand="0" w:evenVBand="0" w:oddHBand="0" w:evenHBand="0" w:firstRowFirstColumn="0" w:firstRowLastColumn="0" w:lastRowFirstColumn="0" w:lastRowLastColumn="0"/>
+            <w:tcW w:w="2201" w:type="dxa"/>
+          </w:tcPr>
+          <w:p>
+            <w:pPr>
+              <w:rPr>
+                <w:rFonts w:ascii="Century Gothic" w:hAnsi="Century Gothic"/>
+              </w:rPr>
+            </w:pPr>
+            <w:bookmarkStart w:id="0" w:name="_GoBack"/>
+            <w:bookmarkEnd w:id="0"/>
+            <w:r>
+              <w:rPr>
+                <w:rFonts w:ascii="Century Gothic" w:hAnsi="Century Gothic"/>
+              </w:rPr>
+              <w:t>Metric</w:t>
+            </w:r>
+          </w:p>
+        </w:tc>
+        <w:tc>
+          <w:tcPr>
+            <w:tcW w:w="2201" w:type="dxa"/>
+          </w:tcPr>
+          <w:p>
+            <w:pPr>
+              <w:cnfStyle w:val="100000000000" w:firstRow="1" w:lastRow="0" w:firstColumn="0" w:lastColumn="0" w:oddVBand="0" w:evenVBand="0" w:oddHBand="0" w:evenHBand="0" w:firstRowFirstColumn="0" w:firstRowLastColumn="0" w:lastRowFirstColumn="0" w:lastRowLastColumn="0"/>
+              <w:rPr>
+                <w:rFonts w:ascii="Century Gothic" w:hAnsi="Century Gothic"/>
+              </w:rPr>
+            </w:pPr>
+            <w:r>
+              <w:rPr>
+                <w:rFonts w:ascii="Century Gothic" w:hAnsi="Century Gothic"/>
+              </w:rPr>
+              <w:t>Traditional Lab</w:t>
+            </w:r>
+          </w:p>
+        </w:tc>
+        <w:tc>
+          <w:tcPr>
+            <w:tcW w:w="2200" w:type="dxa"/>
+          </w:tcPr>
+          <w:p>
+            <w:pPr>
+              <w:cnfStyle w:val="100000000000" w:firstRow="1" w:lastRow="0" w:firstColumn="0" w:lastColumn="0" w:oddVBand="0" w:evenVBand="0" w:oddHBand="0" w:evenHBand="0" w:firstRowFirstColumn="0" w:firstRowLastColumn="0" w:lastRowFirstColumn="0" w:lastRowLastColumn="0"/>
+              <w:rPr>
+                <w:rFonts w:ascii="Century Gothic" w:hAnsi="Century Gothic"/>
+              </w:rPr>
+            </w:pPr>
+            <w:r>
+              <w:rPr>
+                <w:rFonts w:ascii="Century Gothic" w:hAnsi="Century Gothic"/>
+              </w:rPr>
+              <w:t>Perennial</w:t>
+            </w:r>
+          </w:p>
+        </w:tc>
+        <w:tc>
+          <w:tcPr>
+            <w:tcW w:w="2201" w:type="dxa"/>
+          </w:tcPr>
+          <w:p>
+            <w:pPr>
+              <w:cnfStyle w:val="100000000000" w:firstRow="1" w:lastRow="0" w:firstColumn="0" w:lastColumn="0" w:oddVBand="0" w:evenVBand="0" w:oddHBand="0" w:evenHBand="0" w:firstRowFirstColumn="0" w:firstRowLastColumn="0" w:lastRowFirstColumn="0" w:lastRowLastColumn="0"/>
+              <w:rPr>
+                <w:rFonts w:ascii="Century Gothic" w:hAnsi="Century Gothic"/>
+              </w:rPr>
+            </w:pPr>
+            <w:proofErr w:type="spellStart"/>
+            <w:r>
+              <w:rPr>
+                <w:rFonts w:ascii="Century Gothic" w:hAnsi="Century Gothic"/>
+              </w:rPr>
+              <w:t>EarthOptics</w:t>
+            </w:r>
+            <w:proofErr w:type="spellEnd"/>
+          </w:p>
+        </w:tc>
+        <w:tc>
+          <w:tcPr>
+            <w:tcW w:w="2208" w:type="dxa"/>
+          </w:tcPr>
+          <w:p>
+            <w:pPr>
+              <w:cnfStyle w:val="100000000000" w:firstRow="1" w:lastRow="0" w:firstColumn="0" w:lastColumn="0" w:oddVBand="0" w:evenVBand="0" w:oddHBand="0" w:evenHBand="0" w:firstRowFirstColumn="0" w:firstRowLastColumn="0" w:lastRowFirstColumn="0" w:lastRowLastColumn="0"/>
+              <w:rPr>
+                <w:rFonts w:ascii="Century Gothic" w:hAnsi="Century Gothic"/>
+              </w:rPr>
+            </w:pPr>
+            <w:r>
+              <w:rPr>
+                <w:rFonts w:ascii="Century Gothic" w:hAnsi="Century Gothic"/>
+              </w:rPr>
+              <w:t>VARIA Carbon</w:t>
+            </w:r>
+          </w:p>
+        </w:tc>
+      </w:tr>
+      <w:tr>
+        <w:trPr>
+          <w:cnfStyle w:val="000000100000" w:firstRow="0" w:lastRow="0" w:firstColumn="0" w:lastColumn="0" w:oddVBand="0" w:evenVBand="0" w:oddHBand="1" w:evenHBand="0" w:firstRowFirstColumn="0" w:firstRowLastColumn="0" w:lastRowFirstColumn="0" w:lastRowLastColumn="0"/>
+          <w:trHeight w:val="791"/>
+        </w:trPr>
+        <w:tc>
+          <w:tcPr>
+            <w:cnfStyle w:val="001000000000" w:firstRow="0" w:lastRow="0" w:firstColumn="1" w:lastColumn="0" w:oddVBand="0" w:evenVBand="0" w:oddHBand="0" w:evenHBand="0" w:firstRowFirstColumn="0" w:firstRowLastColumn="0" w:lastRowFirstColumn="0" w:lastRowLastColumn="0"/>
+            <w:tcW w:w="2201" w:type="dxa"/>
+          </w:tcPr>
+          <w:p>
+            <w:pPr>
+              <w:rPr>
+                <w:rFonts w:ascii="Century Gothic" w:hAnsi="Century Gothic"/>
+              </w:rPr>
+            </w:pPr>
+            <w:r>
+              <w:rPr>
+                <w:rFonts w:ascii="Century Gothic" w:hAnsi="Century Gothic"/>
+              </w:rPr>
+              <w:t>Cost/ha</w:t>
+            </w:r>
+          </w:p>
+        </w:tc>
+        <w:tc>
+          <w:tcPr>
+            <w:tcW w:w="2201" w:type="dxa"/>
+          </w:tcPr>
+          <w:p>
+            <w:pPr>
+              <w:cnfStyle w:val="000000100000" w:firstRow="0" w:lastRow="0" w:firstColumn="0" w:lastColumn="0" w:oddVBand="0" w:evenVBand="0" w:oddHBand="1" w:evenHBand="0" w:firstRowFirstColumn="0" w:firstRowLastColumn="0" w:lastRowFirstColumn="0" w:lastRowLastColumn="0"/>
+              <w:rPr>
+                <w:rFonts w:ascii="Century Gothic" w:hAnsi="Century Gothic"/>
+              </w:rPr>
+            </w:pPr>
+            <w:r>
+              <w:rPr>
+                <w:rFonts w:ascii="Century Gothic" w:hAnsi="Century Gothic"/>
+              </w:rPr>
+              <w:t>$30-50</w:t>
+            </w:r>
+          </w:p>
+        </w:tc>
+        <w:tc>
+          <w:tcPr>
+            <w:tcW w:w="2200" w:type="dxa"/>
+          </w:tcPr>
+          <w:p>
+            <w:pPr>
+              <w:cnfStyle w:val="000000100000" w:firstRow="0" w:lastRow="0" w:firstColumn="0" w:lastColumn="0" w:oddVBand="0" w:evenVBand="0" w:oddHBand="1" w:evenHBand="0" w:firstRowFirstColumn="0" w:firstRowLastColumn="0" w:lastRowFirstColumn="0" w:lastRowLastColumn="0"/>
+              <w:rPr>
+                <w:rFonts w:ascii="Century Gothic" w:hAnsi="Century Gothic"/>
+              </w:rPr>
+            </w:pPr>
+            <w:r>
+              <w:rPr>
+                <w:rFonts w:ascii="Century Gothic" w:hAnsi="Century Gothic"/>
+              </w:rPr>
+              <w:t>$15-25</w:t>
+            </w:r>
+          </w:p>
+        </w:tc>
+        <w:tc>
+          <w:tcPr>
+            <w:tcW w:w="2201" w:type="dxa"/>
+          </w:tcPr>
+          <w:p>
+            <w:pPr>
+              <w:cnfStyle w:val="000000100000" w:firstRow="0" w:lastRow="0" w:firstColumn="0" w:lastColumn="0" w:oddVBand="0" w:evenVBand="0" w:oddHBand="1" w:evenHBand="0" w:firstRowFirstColumn="0" w:firstRowLastColumn="0" w:lastRowFirstColumn="0" w:lastRowLastColumn="0"/>
+              <w:rPr>
+                <w:rFonts w:ascii="Century Gothic" w:hAnsi="Century Gothic"/>
+              </w:rPr>
+            </w:pPr>
+            <w:r>
+              <w:rPr>
+                <w:rFonts w:ascii="Century Gothic" w:hAnsi="Century Gothic"/>
+              </w:rPr>
+              <w:t>$20-30</w:t>
+            </w:r>
+          </w:p>
+        </w:tc>
+        <w:tc>
+          <w:tcPr>
+            <w:tcW w:w="2208" w:type="dxa"/>
+          </w:tcPr>
+          <w:p>
+            <w:pPr>
+              <w:cnfStyle w:val="000000100000" w:firstRow="0" w:lastRow="0" w:firstColumn="0" w:lastColumn="0" w:oddVBand="0" w:evenVBand="0" w:oddHBand="1" w:evenHBand="0" w:firstRowFirstColumn="0" w:firstRowLastColumn="0" w:lastRowFirstColumn="0" w:lastRowLastColumn="0"/>
+              <w:rPr>
+                <w:rFonts w:ascii="Century Gothic" w:hAnsi="Century Gothic"/>
+              </w:rPr>
+            </w:pPr>
+            <w:r>
+              <w:rPr>
+                <w:rFonts w:ascii="Century Gothic" w:hAnsi="Century Gothic"/>
+              </w:rPr>
+              <w:t>$5-10*</w:t>
+            </w:r>
+          </w:p>
+        </w:tc>
+      </w:tr>
+      <w:tr>
+        <w:trPr>
+          <w:trHeight w:val="692"/>
+        </w:trPr>
+        <w:tc>
+          <w:tcPr>
+            <w:cnfStyle w:val="001000000000" w:firstRow="0" w:lastRow="0" w:firstColumn="1" w:lastColumn="0" w:oddVBand="0" w:evenVBand="0" w:oddHBand="0" w:evenHBand="0" w:firstRowFirstColumn="0" w:firstRowLastColumn="0" w:lastRowFirstColumn="0" w:lastRowLastColumn="0"/>
+            <w:tcW w:w="2201" w:type="dxa"/>
+          </w:tcPr>
+          <w:p>
+            <w:pPr>
+              <w:rPr>
+                <w:rFonts w:ascii="Century Gothic" w:hAnsi="Century Gothic"/>
+              </w:rPr>
+            </w:pPr>
+            <w:r>
+              <w:rPr>
+                <w:rFonts w:ascii="Century Gothic" w:hAnsi="Century Gothic"/>
+              </w:rPr>
+              <w:t>Time</w:t>
+            </w:r>
+          </w:p>
+        </w:tc>
+        <w:tc>
+          <w:tcPr>
+            <w:tcW w:w="2201" w:type="dxa"/>
+          </w:tcPr>
+          <w:p>
+            <w:pPr>
+              <w:cnfStyle w:val="000000000000" w:firstRow="0" w:lastRow="0" w:firstColumn="0" w:lastColumn="0" w:oddVBand="0" w:evenVBand="0" w:oddHBand="0" w:evenHBand="0" w:firstRowFirstColumn="0" w:firstRowLastColumn="0" w:lastRowFirstColumn="0" w:lastRowLastColumn="0"/>
+              <w:rPr>
+                <w:rFonts w:ascii="Century Gothic" w:hAnsi="Century Gothic"/>
+              </w:rPr>
+            </w:pPr>
+            <w:r>
+              <w:rPr>
+                <w:rFonts w:ascii="Century Gothic" w:hAnsi="Century Gothic"/>
+              </w:rPr>
+              <w:t>Weeks</w:t>
+            </w:r>
+          </w:p>
+        </w:tc>
+        <w:tc>
+          <w:tcPr>
+            <w:tcW w:w="2200" w:type="dxa"/>
+          </w:tcPr>
+          <w:p>
+            <w:pPr>
+              <w:cnfStyle w:val="000000000000" w:firstRow="0" w:lastRow="0" w:firstColumn="0" w:lastColumn="0" w:oddVBand="0" w:evenVBand="0" w:oddHBand="0" w:evenHBand="0" w:firstRowFirstColumn="0" w:firstRowLastColumn="0" w:lastRowFirstColumn="0" w:lastRowLastColumn="0"/>
+              <w:rPr>
+                <w:rFonts w:ascii="Century Gothic" w:hAnsi="Century Gothic"/>
+              </w:rPr>
+            </w:pPr>
+            <w:r>
+              <w:rPr>
+                <w:rFonts w:ascii="Century Gothic" w:hAnsi="Century Gothic"/>
+              </w:rPr>
+              <w:t>Hours</w:t>
+            </w:r>
+          </w:p>
+        </w:tc>
+        <w:tc>
+          <w:tcPr>
+            <w:tcW w:w="2201" w:type="dxa"/>
+          </w:tcPr>
+          <w:p>
+            <w:pPr>
+              <w:cnfStyle w:val="000000000000" w:firstRow="0" w:lastRow="0" w:firstColumn="0" w:lastColumn="0" w:oddVBand="0" w:evenVBand="0" w:oddHBand="0" w:evenHBand="0" w:firstRowFirstColumn="0" w:firstRowLastColumn="0" w:lastRowFirstColumn="0" w:lastRowLastColumn="0"/>
+              <w:rPr>
+                <w:rFonts w:ascii="Century Gothic" w:hAnsi="Century Gothic"/>
+              </w:rPr>
+            </w:pPr>
+            <w:r>
+              <w:rPr>
+                <w:rFonts w:ascii="Century Gothic" w:hAnsi="Century Gothic"/>
+              </w:rPr>
+              <w:t>Days</w:t>
+            </w:r>
+          </w:p>
+        </w:tc>
+        <w:tc>
+          <w:tcPr>
+            <w:tcW w:w="2208" w:type="dxa"/>
+          </w:tcPr>
+          <w:p>
+            <w:pPr>
+              <w:cnfStyle w:val="000000000000" w:firstRow="0" w:lastRow="0" w:firstColumn="0" w:lastColumn="0" w:oddVBand="0" w:evenVBand="0" w:oddHBand="0" w:evenHBand="0" w:firstRowFirstColumn="0" w:firstRowLastColumn="0" w:lastRowFirstColumn="0" w:lastRowLastColumn="0"/>
+              <w:rPr>
+                <w:rFonts w:ascii="Century Gothic" w:hAnsi="Century Gothic"/>
+              </w:rPr>
+            </w:pPr>
+            <w:r>
+              <w:rPr>
+                <w:rFonts w:ascii="Century Gothic" w:hAnsi="Century Gothic"/>
+              </w:rPr>
+              <w:t>Minutes</w:t>
+            </w:r>
+          </w:p>
+        </w:tc>
+      </w:tr>
+      <w:tr>
+        <w:trPr>
+          <w:cnfStyle w:val="000000100000" w:firstRow="0" w:lastRow="0" w:firstColumn="0" w:lastColumn="0" w:oddVBand="0" w:evenVBand="0" w:oddHBand="1" w:evenHBand="0" w:firstRowFirstColumn="0" w:firstRowLastColumn="0" w:lastRowFirstColumn="0" w:lastRowLastColumn="0"/>
+          <w:trHeight w:val="773"/>
+        </w:trPr>
+        <w:tc>
+          <w:tcPr>
+            <w:cnfStyle w:val="001000000000" w:firstRow="0" w:lastRow="0" w:firstColumn="1" w:lastColumn="0" w:oddVBand="0" w:evenVBand="0" w:oddHBand="0" w:evenHBand="0" w:firstRowFirstColumn="0" w:firstRowLastColumn="0" w:lastRowFirstColumn="0" w:lastRowLastColumn="0"/>
+            <w:tcW w:w="2201" w:type="dxa"/>
+          </w:tcPr>
+          <w:p>
+            <w:pPr>
+              <w:rPr>
+                <w:rFonts w:ascii="Century Gothic" w:hAnsi="Century Gothic"/>
+              </w:rPr>
+            </w:pPr>
+            <w:r>
+              <w:rPr>
+                <w:rFonts w:ascii="Century Gothic" w:hAnsi="Century Gothic"/>
+              </w:rPr>
+              <w:t>Field visit</w:t>
+            </w:r>
+          </w:p>
+        </w:tc>
+        <w:tc>
+          <w:tcPr>
+            <w:tcW w:w="2201" w:type="dxa"/>
+          </w:tcPr>
+          <w:p>
+            <w:pPr>
+              <w:cnfStyle w:val="000000100000" w:firstRow="0" w:lastRow="0" w:firstColumn="0" w:lastColumn="0" w:oddVBand="0" w:evenVBand="0" w:oddHBand="1" w:evenHBand="0" w:firstRowFirstColumn="0" w:firstRowLastColumn="0" w:lastRowFirstColumn="0" w:lastRowLastColumn="0"/>
+              <w:rPr>
+                <w:rFonts w:ascii="Century Gothic" w:hAnsi="Century Gothic"/>
+              </w:rPr>
+            </w:pPr>
+            <w:r>
+              <w:rPr>
+                <w:rFonts w:ascii="Century Gothic" w:hAnsi="Century Gothic"/>
+              </w:rPr>
+              <w:t>Required</w:t>
+            </w:r>
+          </w:p>
+        </w:tc>
+        <w:tc>
+          <w:tcPr>
+            <w:tcW w:w="2200" w:type="dxa"/>
+          </w:tcPr>
+          <w:p>
+            <w:pPr>
+              <w:cnfStyle w:val="000000100000" w:firstRow="0" w:lastRow="0" w:firstColumn="0" w:lastColumn="0" w:oddVBand="0" w:evenVBand="0" w:oddHBand="1" w:evenHBand="0" w:firstRowFirstColumn="0" w:firstRowLastColumn="0" w:lastRowFirstColumn="0" w:lastRowLastColumn="0"/>
+              <w:rPr>
+                <w:rFonts w:ascii="Century Gothic" w:hAnsi="Century Gothic"/>
+              </w:rPr>
+            </w:pPr>
+            <w:r>
+              <w:rPr>
+                <w:rFonts w:ascii="Century Gothic" w:hAnsi="Century Gothic"/>
+              </w:rPr>
+              <w:t>Optional</w:t>
+            </w:r>
+          </w:p>
+        </w:tc>
+        <w:tc>
+          <w:tcPr>
+            <w:tcW w:w="2201" w:type="dxa"/>
+          </w:tcPr>
+          <w:p>
+            <w:pPr>
+              <w:cnfStyle w:val="000000100000" w:firstRow="0" w:lastRow="0" w:firstColumn="0" w:lastColumn="0" w:oddVBand="0" w:evenVBand="0" w:oddHBand="1" w:evenHBand="0" w:firstRowFirstColumn="0" w:firstRowLastColumn="0" w:lastRowFirstColumn="0" w:lastRowLastColumn="0"/>
+              <w:rPr>
+                <w:rFonts w:ascii="Century Gothic" w:hAnsi="Century Gothic"/>
+              </w:rPr>
+            </w:pPr>
+            <w:r>
+              <w:rPr>
+                <w:rFonts w:ascii="Century Gothic" w:hAnsi="Century Gothic"/>
+              </w:rPr>
+              <w:t>Required</w:t>
+            </w:r>
+          </w:p>
+        </w:tc>
+        <w:tc>
+          <w:tcPr>
+            <w:tcW w:w="2208" w:type="dxa"/>
+          </w:tcPr>
+          <w:p>
+            <w:pPr>
+              <w:cnfStyle w:val="000000100000" w:firstRow="0" w:lastRow="0" w:firstColumn="0" w:lastColumn="0" w:oddVBand="0" w:evenVBand="0" w:oddHBand="1" w:evenHBand="0" w:firstRowFirstColumn="0" w:firstRowLastColumn="0" w:lastRowFirstColumn="0" w:lastRowLastColumn="0"/>
+              <w:rPr>
+                <w:rFonts w:ascii="Century Gothic" w:hAnsi="Century Gothic"/>
+              </w:rPr>
+            </w:pPr>
+            <w:r>
+              <w:rPr>
+                <w:rFonts w:ascii="Century Gothic" w:hAnsi="Century Gothic"/>
+              </w:rPr>
+              <w:t>Not required</w:t>
+            </w:r>
+          </w:p>
+        </w:tc>
+      </w:tr>
+      <w:tr>
+        <w:trPr>
+          <w:trHeight w:val="755"/>
+        </w:trPr>
+        <w:tc>
+          <w:tcPr>
+            <w:cnfStyle w:val="001000000000" w:firstRow="0" w:lastRow="0" w:firstColumn="1" w:lastColumn="0" w:oddVBand="0" w:evenVBand="0" w:oddHBand="0" w:evenHBand="0" w:firstRowFirstColumn="0" w:firstRowLastColumn="0" w:lastRowFirstColumn="0" w:lastRowLastColumn="0"/>
+            <w:tcW w:w="2201" w:type="dxa"/>
+          </w:tcPr>
+          <w:p>
+            <w:pPr>
+              <w:rPr>
+                <w:rFonts w:ascii="Century Gothic" w:hAnsi="Century Gothic"/>
+              </w:rPr>
+            </w:pPr>
+            <w:r>
+              <w:rPr>
+                <w:rFonts w:ascii="Century Gothic" w:hAnsi="Century Gothic"/>
+              </w:rPr>
+              <w:t>Deployment</w:t>
+            </w:r>
+          </w:p>
+        </w:tc>
+        <w:tc>
+          <w:tcPr>
+            <w:tcW w:w="2201" w:type="dxa"/>
+          </w:tcPr>
+          <w:p>
+            <w:pPr>
+              <w:cnfStyle w:val="000000000000" w:firstRow="0" w:lastRow="0" w:firstColumn="0" w:lastColumn="0" w:oddVBand="0" w:evenVBand="0" w:oddHBand="0" w:evenHBand="0" w:firstRowFirstColumn="0" w:firstRowLastColumn="0" w:lastRowFirstColumn="0" w:lastRowLastColumn="0"/>
+              <w:rPr>
+                <w:rFonts w:ascii="Century Gothic" w:hAnsi="Century Gothic"/>
+              </w:rPr>
+            </w:pPr>
+            <w:r>
+              <w:rPr>
+                <w:rFonts w:ascii="Century Gothic" w:hAnsi="Century Gothic"/>
+              </w:rPr>
+              <w:t>On-site</w:t>
+            </w:r>
+          </w:p>
+        </w:tc>
+        <w:tc>
+          <w:tcPr>
+            <w:tcW w:w="2200" w:type="dxa"/>
+          </w:tcPr>
+          <w:p>
+            <w:pPr>
+              <w:cnfStyle w:val="000000000000" w:firstRow="0" w:lastRow="0" w:firstColumn="0" w:lastColumn="0" w:oddVBand="0" w:evenVBand="0" w:oddHBand="0" w:evenHBand="0" w:firstRowFirstColumn="0" w:firstRowLastColumn="0" w:lastRowFirstColumn="0" w:lastRowLastColumn="0"/>
+              <w:rPr>
+                <w:rFonts w:ascii="Century Gothic" w:hAnsi="Century Gothic"/>
+              </w:rPr>
+            </w:pPr>
+            <w:r>
+              <w:rPr>
+                <w:rFonts w:ascii="Century Gothic" w:hAnsi="Century Gothic"/>
+              </w:rPr>
+              <w:t>Cloud</w:t>
+            </w:r>
+          </w:p>
+        </w:tc>
+        <w:tc>
+          <w:tcPr>
+            <w:tcW w:w="2201" w:type="dxa"/>
+          </w:tcPr>
+          <w:p>
+            <w:pPr>
+              <w:cnfStyle w:val="000000000000" w:firstRow="0" w:lastRow="0" w:firstColumn="0" w:lastColumn="0" w:oddVBand="0" w:evenVBand="0" w:oddHBand="0" w:evenHBand="0" w:firstRowFirstColumn="0" w:firstRowLastColumn="0" w:lastRowFirstColumn="0" w:lastRowLastColumn="0"/>
+              <w:rPr>
+                <w:rFonts w:ascii="Century Gothic" w:hAnsi="Century Gothic"/>
+              </w:rPr>
+            </w:pPr>
+            <w:r>
+              <w:rPr>
+                <w:rFonts w:ascii="Century Gothic" w:hAnsi="Century Gothic"/>
+              </w:rPr>
+              <w:t>Hybrid</w:t>
+            </w:r>
+          </w:p>
+        </w:tc>
+        <w:tc>
+          <w:tcPr>
+            <w:tcW w:w="2208" w:type="dxa"/>
+          </w:tcPr>
+          <w:p>
+            <w:pPr>
+              <w:cnfStyle w:val="000000000000" w:firstRow="0" w:lastRow="0" w:firstColumn="0" w:lastColumn="0" w:oddVBand="0" w:evenVBand="0" w:oddHBand="0" w:evenHBand="0" w:firstRowFirstColumn="0" w:firstRowLastColumn="0" w:lastRowFirstColumn="0" w:lastRowLastColumn="0"/>
+              <w:rPr>
+                <w:rFonts w:ascii="Century Gothic" w:hAnsi="Century Gothic"/>
+              </w:rPr>
+            </w:pPr>
+            <w:r>
+              <w:rPr>
+                <w:rFonts w:ascii="Century Gothic" w:hAnsi="Century Gothic"/>
+              </w:rPr>
+              <w:t>On-premise</w:t>
+            </w:r>
+          </w:p>
+        </w:tc>
+      </w:tr>
+      <w:tr>
+        <w:trPr>
+          <w:cnfStyle w:val="000000100000" w:firstRow="0" w:lastRow="0" w:firstColumn="0" w:lastColumn="0" w:oddVBand="0" w:evenVBand="0" w:oddHBand="1" w:evenHBand="0" w:firstRowFirstColumn="0" w:firstRowLastColumn="0" w:lastRowFirstColumn="0" w:lastRowLastColumn="0"/>
+          <w:trHeight w:val="1310"/>
+        </w:trPr>
+        <w:tc>
+          <w:tcPr>
+            <w:cnfStyle w:val="001000000000" w:firstRow="0" w:lastRow="0" w:firstColumn="1" w:lastColumn="0" w:oddVBand="0" w:evenVBand="0" w:oddHBand="0" w:evenHBand="0" w:firstRowFirstColumn="0" w:firstRowLastColumn="0" w:lastRowFirstColumn="0" w:lastRowLastColumn="0"/>
+            <w:tcW w:w="2201" w:type="dxa"/>
+          </w:tcPr>
+          <w:p>
+            <w:pPr>
+              <w:rPr>
+                <w:rFonts w:ascii="Century Gothic" w:hAnsi="Century Gothic"/>
+              </w:rPr>
+            </w:pPr>
+            <w:r>
+              <w:rPr>
+                <w:rFonts w:ascii="Century Gothic" w:hAnsi="Century Gothic"/>
+              </w:rPr>
+              <w:t>Open source</w:t>
+            </w:r>
+          </w:p>
+        </w:tc>
+        <w:tc>
+          <w:tcPr>
+            <w:tcW w:w="2201" w:type="dxa"/>
+          </w:tcPr>
+          <w:p>
+            <w:pPr>
+              <w:cnfStyle w:val="000000100000" w:firstRow="0" w:lastRow="0" w:firstColumn="0" w:lastColumn="0" w:oddVBand="0" w:evenVBand="0" w:oddHBand="1" w:evenHBand="0" w:firstRowFirstColumn="0" w:firstRowLastColumn="0" w:lastRowFirstColumn="0" w:lastRowLastColumn="0"/>
+              <w:rPr>
+                <w:rFonts w:ascii="Century Gothic" w:hAnsi="Century Gothic"/>
+              </w:rPr>
+            </w:pPr>
+            <w:r>
+              <w:rPr>
+                <w:rFonts w:ascii="Century Gothic" w:hAnsi="Century Gothic"/>
+              </w:rPr>
+              <w:t>No</w:t>
+            </w:r>
+          </w:p>
+        </w:tc>
+        <w:tc>
+          <w:tcPr>
+            <w:tcW w:w="2200" w:type="dxa"/>
+          </w:tcPr>
+          <w:p>
+            <w:pPr>
+              <w:cnfStyle w:val="000000100000" w:firstRow="0" w:lastRow="0" w:firstColumn="0" w:lastColumn="0" w:oddVBand="0" w:evenVBand="0" w:oddHBand="1" w:evenHBand="0" w:firstRowFirstColumn="0" w:firstRowLastColumn="0" w:lastRowFirstColumn="0" w:lastRowLastColumn="0"/>
+              <w:rPr>
+                <w:rFonts w:ascii="Century Gothic" w:hAnsi="Century Gothic"/>
+              </w:rPr>
+            </w:pPr>
+            <w:r>
+              <w:rPr>
+                <w:rFonts w:ascii="Century Gothic" w:hAnsi="Century Gothic"/>
+              </w:rPr>
+              <w:t>No</w:t>
+            </w:r>
+          </w:p>
+        </w:tc>
+        <w:tc>
+          <w:tcPr>
+            <w:tcW w:w="2201" w:type="dxa"/>
+          </w:tcPr>
+          <w:p>
+            <w:pPr>
+              <w:cnfStyle w:val="000000100000" w:firstRow="0" w:lastRow="0" w:firstColumn="0" w:lastColumn="0" w:oddVBand="0" w:evenVBand="0" w:oddHBand="1" w:evenHBand="0" w:firstRowFirstColumn="0" w:firstRowLastColumn="0" w:lastRowFirstColumn="0" w:lastRowLastColumn="0"/>
+              <w:rPr>
+                <w:rFonts w:ascii="Century Gothic" w:hAnsi="Century Gothic"/>
+              </w:rPr>
+            </w:pPr>
+            <w:r>
+              <w:rPr>
+                <w:rFonts w:ascii="Century Gothic" w:hAnsi="Century Gothic"/>
+              </w:rPr>
+              <w:t>No</w:t>
+            </w:r>
+          </w:p>
+        </w:tc>
+        <w:tc>
+          <w:tcPr>
+            <w:tcW w:w="2208" w:type="dxa"/>
+          </w:tcPr>
+          <w:p>
+            <w:pPr>
+              <w:cnfStyle w:val="000000100000" w:firstRow="0" w:lastRow="0" w:firstColumn="0" w:lastColumn="0" w:oddVBand="0" w:evenVBand="0" w:oddHBand="1" w:evenHBand="0" w:firstRowFirstColumn="0" w:firstRowLastColumn="0" w:lastRowFirstColumn="0" w:lastRowLastColumn="0"/>
+              <w:rPr>
+                <w:rFonts w:ascii="Century Gothic" w:hAnsi="Century Gothic"/>
+              </w:rPr>
+            </w:pPr>
+            <w:r>
+              <w:rPr>
+                <w:rFonts w:ascii="Century Gothic" w:hAnsi="Century Gothic"/>
+              </w:rPr>
+              <w:t>Yes (code included)</w:t>
+            </w:r>
+            <w:r>
+              <w:rPr>
+                <w:rFonts w:ascii="Century Gothic" w:hAnsi="Century Gothic"/>
+              </w:rPr>
+              <w:t>*One-time license cost, amortized over area</w:t>
+            </w:r>
+          </w:p>
+        </w:tc>
+      </w:tr>
+    </w:tbl>
+    <w:p>
+      <w:pPr>
+        <w:rPr>
+          <w:rFonts w:ascii="Century Gothic" w:hAnsi="Century Gothic"/>
+        </w:rPr>
+      </w:pPr>
+    </w:p>
+    <w:p>
+      <w:pPr>
+        <w:rPr>
+          <w:rFonts w:ascii="Century Gothic" w:hAnsi="Century Gothic"/>
+        </w:rPr>
+      </w:pPr>
+      <w:r>
+        <w:rPr>
+          <w:rFonts w:ascii="Century Gothic" w:hAnsi="Century Gothic"/>
+        </w:rPr>
+        <w:t>Advantages of VARIA Carbon:</w:t>
+      </w:r>
+    </w:p>
+    <w:p>
+      <w:pPr>
+        <w:rPr>
+          <w:rFonts w:ascii="Century Gothic" w:hAnsi="Century Gothic"/>
+        </w:rPr>
+      </w:pPr>
+      <w:r>
+        <w:rPr>
+          <w:rFonts w:ascii="Century Gothic" w:hAnsi="Century Gothic"/>
+        </w:rPr>
+        <w:t>1. Customer owns the code (no vendor lock-in)</w:t>
+      </w:r>
+    </w:p>
+    <w:p>
+      <w:pPr>
+        <w:rPr>
+          <w:rFonts w:ascii="Century Gothic" w:hAnsi="Century Gothic"/>
+        </w:rPr>
+      </w:pPr>
+      <w:r>
+        <w:rPr>
+          <w:rFonts w:ascii="Century Gothic" w:hAnsi="Century Gothic"/>
+        </w:rPr>
+        <w:t>2. Runs on customer's server (data privacy)</w:t>
+      </w:r>
+    </w:p>
+    <w:p>
+      <w:pPr>
+        <w:rPr>
+          <w:rFonts w:ascii="Century Gothic" w:hAnsi="Century Gothic"/>
+        </w:rPr>
+      </w:pPr>
+      <w:r>
+        <w:rPr>
+          <w:rFonts w:ascii="Century Gothic" w:hAnsi="Century Gothic"/>
+        </w:rPr>
+        <w:t>3. No ongoing subscription fees</w:t>
+      </w:r>
+    </w:p>
+    <w:p>
+      <w:pPr>
+        <w:rPr>
+          <w:rFonts w:ascii="Century Gothic" w:hAnsi="Century Gothic"/>
+        </w:rPr>
+      </w:pPr>
+      <w:r>
+        <w:rPr>
+          <w:rFonts w:ascii="Century Gothic" w:hAnsi="Century Gothic"/>
+        </w:rPr>
+        <w:t>4. Transparent, auditable algorithm</w:t>
+      </w:r>
+    </w:p>
+    <w:p>
+      <w:pPr>
+        <w:rPr>
+          <w:rFonts w:ascii="Century Gothic" w:hAnsi="Century Gothic"/>
+        </w:rPr>
+      </w:pPr>
+    </w:p>
+    <w:p>
+      <w:pPr>
+        <w:rPr>
+          <w:rFonts w:ascii="Century Gothic" w:hAnsi="Century Gothic"/>
+        </w:rPr>
+      </w:pPr>
+    </w:p>
+    <w:p>
+      <w:pPr>
+        <w:rPr>
+          <w:rFonts w:ascii="Century Gothic" w:hAnsi="Century Gothic"/>
+        </w:rPr>
+      </w:pPr>
+    </w:p>
+    <w:p>
+      <w:pPr>
+        <w:rPr>
+          <w:rFonts w:ascii="Century Gothic" w:hAnsi="Century Gothic"/>
+        </w:rPr>
+      </w:pPr>
+    </w:p>
+    <w:p>
+      <w:pPr>
+        <w:rPr>
+          <w:rFonts w:ascii="Century Gothic" w:hAnsi="Century Gothic"/>
+        </w:rPr>
+      </w:pPr>
+    </w:p>
+    <w:p>
+      <w:pPr>
+        <w:rPr>
+          <w:rFonts w:ascii="Century Gothic" w:hAnsi="Century Gothic"/>
+        </w:rPr>
+      </w:pPr>
+    </w:p>
+    <w:p>
+      <w:pPr>
+        <w:rPr>
+          <w:rFonts w:ascii="Century Gothic" w:hAnsi="Century Gothic"/>
+        </w:rPr>
+      </w:pPr>
+    </w:p>
+    <w:p>
+      <w:pPr>
+        <w:rPr>
+          <w:rFonts w:ascii="Century Gothic" w:hAnsi="Century Gothic"/>
+        </w:rPr>
+      </w:pPr>
+    </w:p>
+    <w:p>
+      <w:pPr>
+        <w:rPr>
+          <w:rFonts w:ascii="Century Gothic" w:hAnsi="Century Gothic"/>
+        </w:rPr>
+      </w:pPr>
+    </w:p>
+    <w:p>
+      <w:pPr>
+        <w:rPr>
+          <w:rFonts w:ascii="Century Gothic" w:hAnsi="Century Gothic"/>
+        </w:rPr>
+      </w:pPr>
+    </w:p>
+    <w:p>
+      <w:pPr>
+        <w:rPr>
+          <w:rFonts w:ascii="Century Gothic" w:hAnsi="Century Gothic"/>
+        </w:rPr>
+      </w:pPr>
+    </w:p>
+    <w:p>
+      <w:pPr>
+        <w:rPr>
+          <w:rFonts w:ascii="Century Gothic" w:hAnsi="Century Gothic"/>
+        </w:rPr>
+      </w:pPr>
+    </w:p>
+    <w:p>
+      <w:pPr>
+        <w:rPr>
+          <w:rFonts w:ascii="Century Gothic" w:hAnsi="Century Gothic"/>
+        </w:rPr>
+      </w:pPr>
+      <w:r>
+        <w:rPr>
+          <w:rFonts w:ascii="Century Gothic" w:hAnsi="Century Gothic"/>
+        </w:rPr>
+        <w:t>System Architecture:</w:t>
+      </w:r>
+    </w:p>
+    <w:p>
+      <w:pPr>
+        <w:rPr>
+          <w:rFonts w:ascii="Century Gothic" w:hAnsi="Century Gothic"/>
+        </w:rPr>
+      </w:pPr>
+    </w:p>
+    <w:p>
+      <w:pPr>
+        <w:rPr>
+          <w:rFonts w:ascii="Century Gothic" w:hAnsi="Century Gothic"/>
+        </w:rPr>
+      </w:pPr>
+      <w:r>
+        <w:rPr>
+          <w:rFonts w:ascii="Century Gothic" w:hAnsi="Century Gothic"/>
+        </w:rPr>
+        <w:t>[User Input] → [</w:t>
       </w:r>
       <w:proofErr w:type="spellStart"/>
       <w:r>
         <w:rPr>
           <w:rFonts w:ascii="Century Gothic" w:hAnsi="Century Gothic"/>
         </w:rPr>
-        <w:t>EarthOptics</w:t>
+        <w:t>Streamlit</w:t>
       </w:r>
       <w:proofErr w:type="spellEnd"/>
       <w:r>
         <w:rPr>
           <w:rFonts w:ascii="Century Gothic" w:hAnsi="Century Gothic"/>
         </w:rPr>
-        <w:t xml:space="preserve"> | VARIA Carbon |</w:t>
-      </w:r>
-    </w:p>
-    <w:p>
-      <w:pPr>
-        <w:rPr>
-          <w:rFonts w:ascii="Century Gothic" w:hAnsi="Century Gothic"/>
-        </w:rPr>
-      </w:pPr>
-      <w:r>
-        <w:rPr>
-          <w:rFonts w:ascii="Century Gothic" w:hAnsi="Century Gothic"/>
-        </w:rPr>
-        <w:t>|--------|----------------|-----------|-------------|--------------|</w:t>
-      </w:r>
-    </w:p>
-    <w:p>
-      <w:pPr>
-        <w:rPr>
-          <w:rFonts w:ascii="Century Gothic" w:hAnsi="Century Gothic"/>
-        </w:rPr>
-      </w:pPr>
-      <w:r>
-        <w:rPr>
-          <w:rFonts w:ascii="Century Gothic" w:hAnsi="Century Gothic"/>
-        </w:rPr>
-        <w:t>| Cost/ha | $30-50 | $15-25 | $20-30 | $5-10* |</w:t>
-      </w:r>
-    </w:p>
-    <w:p>
-      <w:pPr>
-        <w:rPr>
-          <w:rFonts w:ascii="Century Gothic" w:hAnsi="Century Gothic"/>
-        </w:rPr>
-      </w:pPr>
-      <w:r>
-        <w:rPr>
-          <w:rFonts w:ascii="Century Gothic" w:hAnsi="Century Gothic"/>
-        </w:rPr>
-        <w:t>| Time | Weeks | Hours | Days | Minutes |</w:t>
-      </w:r>
-    </w:p>
-    <w:p>
-      <w:pPr>
-        <w:rPr>
-          <w:rFonts w:ascii="Century Gothic" w:hAnsi="Century Gothic"/>
-        </w:rPr>
-      </w:pPr>
-      <w:r>
-        <w:rPr>
-          <w:rFonts w:ascii="Century Gothic" w:hAnsi="Century Gothic"/>
-        </w:rPr>
-        <w:t>| Field visit | Required | Optional | Required | Not required |</w:t>
-      </w:r>
-    </w:p>
-    <w:p>
-      <w:pPr>
-        <w:rPr>
-          <w:rFonts w:ascii="Century Gothic" w:hAnsi="Century Gothic"/>
-        </w:rPr>
-      </w:pPr>
-      <w:r>
-        <w:rPr>
-          <w:rFonts w:ascii="Century Gothic" w:hAnsi="Century Gothic"/>
-        </w:rPr>
-        <w:t>| Deployment | On-site | Cloud | Hybrid | On-premise |</w:t>
-      </w:r>
-    </w:p>
-    <w:p>
-      <w:pPr>
-        <w:rPr>
-          <w:rFonts w:ascii="Century Gothic" w:hAnsi="Century Gothic"/>
-        </w:rPr>
-      </w:pPr>
-      <w:r>
-        <w:rPr>
-          <w:rFonts w:ascii="Century Gothic" w:hAnsi="Century Gothic"/>
-        </w:rPr>
-        <w:t>| Open source | No | No | No | Yes (code included) |</w:t>
-      </w:r>
-    </w:p>
-    <w:p>
-      <w:pPr>
-        <w:rPr>
-          <w:rFonts w:ascii="Century Gothic" w:hAnsi="Century Gothic"/>
-        </w:rPr>
-      </w:pPr>
-    </w:p>
-    <w:p>
-      <w:pPr>
-        <w:rPr>
-          <w:rFonts w:ascii="Century Gothic" w:hAnsi="Century Gothic"/>
-        </w:rPr>
-      </w:pPr>
-      <w:r>
-        <w:rPr>
-          <w:rFonts w:ascii="Century Gothic" w:hAnsi="Century Gothic"/>
-        </w:rPr>
-        <w:t>*One-time license cost, amortized over area</w:t>
-      </w:r>
-    </w:p>
-    <w:p>
-      <w:pPr>
-        <w:rPr>
-          <w:rFonts w:ascii="Century Gothic" w:hAnsi="Century Gothic"/>
-        </w:rPr>
-      </w:pPr>
-    </w:p>
-    <w:p>
-      <w:pPr>
-        <w:rPr>
-          <w:rFonts w:ascii="Century Gothic" w:hAnsi="Century Gothic"/>
-        </w:rPr>
-      </w:pPr>
-      <w:r>
-        <w:rPr>
-          <w:rFonts w:ascii="Century Gothic" w:hAnsi="Century Gothic"/>
-        </w:rPr>
-        <w:t>Advantages of VARIA Carbon:</w:t>
-      </w:r>
-    </w:p>
-    <w:p>
-      <w:pPr>
-        <w:rPr>
-          <w:rFonts w:ascii="Century Gothic" w:hAnsi="Century Gothic"/>
-        </w:rPr>
-      </w:pPr>
-      <w:r>
-        <w:rPr>
-          <w:rFonts w:ascii="Century Gothic" w:hAnsi="Century Gothic"/>
-        </w:rPr>
-        <w:t>1. Customer owns the code (no vendor lock-in)</w:t>
-      </w:r>
-    </w:p>
-    <w:p>
-      <w:pPr>
-        <w:rPr>
-          <w:rFonts w:ascii="Century Gothic" w:hAnsi="Century Gothic"/>
-        </w:rPr>
-      </w:pPr>
-      <w:r>
-        <w:rPr>
-          <w:rFonts w:ascii="Century Gothic" w:hAnsi="Century Gothic"/>
-        </w:rPr>
-        <w:t>2. Runs on customer's server (data privacy)</w:t>
-      </w:r>
-    </w:p>
-    <w:p>
-      <w:pPr>
-        <w:rPr>
-          <w:rFonts w:ascii="Century Gothic" w:hAnsi="Century Gothic"/>
-        </w:rPr>
-      </w:pPr>
-      <w:r>
-        <w:rPr>
-          <w:rFonts w:ascii="Century Gothic" w:hAnsi="Century Gothic"/>
-        </w:rPr>
-        <w:t>3. No ongoing subscription fees</w:t>
-      </w:r>
-    </w:p>
-    <w:p>
-      <w:pPr>
-        <w:rPr>
-          <w:rFonts w:ascii="Century Gothic" w:hAnsi="Century Gothic"/>
-        </w:rPr>
-      </w:pPr>
-      <w:r>
-        <w:rPr>
-          <w:rFonts w:ascii="Century Gothic" w:hAnsi="Century Gothic"/>
-        </w:rPr>
-        <w:t>4. Transparent, auditable algorithm</w:t>
-      </w:r>
-    </w:p>
-    <w:p>
-      <w:pPr>
-        <w:rPr>
-          <w:rFonts w:ascii="Century Gothic" w:hAnsi="Century Gothic"/>
-        </w:rPr>
-      </w:pPr>
-    </w:p>
-    <w:p>
-      <w:pPr>
-        <w:rPr>
-          <w:rFonts w:ascii="Century Gothic" w:hAnsi="Century Gothic"/>
-        </w:rPr>
-      </w:pPr>
-    </w:p>
-    <w:p>
-      <w:pPr>
-        <w:rPr>
-          <w:rFonts w:ascii="Century Gothic" w:hAnsi="Century Gothic"/>
-        </w:rPr>
-      </w:pPr>
-    </w:p>
-    <w:p>
-      <w:pPr>
-        <w:rPr>
-          <w:rFonts w:ascii="Century Gothic" w:hAnsi="Century Gothic"/>
-        </w:rPr>
-      </w:pPr>
-    </w:p>
-    <w:p>
-      <w:pPr>
-        <w:rPr>
-          <w:rFonts w:ascii="Century Gothic" w:hAnsi="Century Gothic"/>
-        </w:rPr>
-      </w:pPr>
-    </w:p>
-    <w:p>
-      <w:pPr>
-        <w:rPr>
-          <w:rFonts w:ascii="Century Gothic" w:hAnsi="Century Gothic"/>
-        </w:rPr>
-      </w:pPr>
-    </w:p>
-    <w:p>
-      <w:pPr>
-        <w:rPr>
-          <w:rFonts w:ascii="Century Gothic" w:hAnsi="Century Gothic"/>
-        </w:rPr>
-      </w:pPr>
-    </w:p>
-    <w:p>
-      <w:pPr>
-        <w:rPr>
-          <w:rFonts w:ascii="Century Gothic" w:hAnsi="Century Gothic"/>
-        </w:rPr>
-      </w:pPr>
-    </w:p>
-    <w:p>
-      <w:pPr>
-        <w:rPr>
-          <w:rFonts w:ascii="Century Gothic" w:hAnsi="Century Gothic"/>
-        </w:rPr>
-      </w:pPr>
-    </w:p>
-    <w:p>
-      <w:pPr>
-        <w:rPr>
-          <w:rFonts w:ascii="Century Gothic" w:hAnsi="Century Gothic"/>
-        </w:rPr>
-      </w:pPr>
-    </w:p>
-    <w:p>
-      <w:pPr>
-        <w:rPr>
-          <w:rFonts w:ascii="Century Gothic" w:hAnsi="Century Gothic"/>
-        </w:rPr>
-      </w:pPr>
-    </w:p>
-    <w:p>
-      <w:pPr>
-        <w:rPr>
-          <w:rFonts w:ascii="Century Gothic" w:hAnsi="Century Gothic"/>
-        </w:rPr>
-      </w:pPr>
-    </w:p>
-    <w:p>
-      <w:pPr>
-        <w:rPr>
-          <w:rFonts w:ascii="Century Gothic" w:hAnsi="Century Gothic"/>
-        </w:rPr>
-      </w:pPr>
-      <w:r>
-        <w:rPr>
-          <w:rFonts w:ascii="Century Gothic" w:hAnsi="Century Gothic"/>
-        </w:rPr>
-        <w:lastRenderedPageBreak/>
-        <w:t>System Architecture:</w:t>
-      </w:r>
-    </w:p>
-    <w:p>
-      <w:pPr>
-        <w:rPr>
-          <w:rFonts w:ascii="Century Gothic" w:hAnsi="Century Gothic"/>
-        </w:rPr>
-      </w:pPr>
-    </w:p>
-    <w:p>
-      <w:pPr>
-        <w:rPr>
-          <w:rFonts w:ascii="Century Gothic" w:hAnsi="Century Gothic"/>
-        </w:rPr>
-      </w:pPr>
-      <w:r>
-        <w:rPr>
-          <w:rFonts w:ascii="Century Gothic" w:hAnsi="Century Gothic"/>
-        </w:rPr>
-        <w:t>[User Input] → [</w:t>
+        <w:t xml:space="preserve"> Dashboard] → [</w:t>
       </w:r>
       <w:proofErr w:type="spellStart"/>
       <w:r>
         <w:rPr>
           <w:rFonts w:ascii="Century Gothic" w:hAnsi="Century Gothic"/>
         </w:rPr>
+        <w:t>FastAPI</w:t>
+      </w:r>
+      <w:proofErr w:type="spellEnd"/>
+      <w:r>
+        <w:rPr>
+          <w:rFonts w:ascii="Century Gothic" w:hAnsi="Century Gothic"/>
+        </w:rPr>
+        <w:t>] → [Random Forest Model] → [SOC% + Carbon Credits]</w:t>
+      </w:r>
+    </w:p>
+    <w:p>
+      <w:pPr>
+        <w:rPr>
+          <w:rFonts w:ascii="Century Gothic" w:hAnsi="Century Gothic"/>
+        </w:rPr>
+      </w:pPr>
+    </w:p>
+    <w:p>
+      <w:pPr>
+        <w:rPr>
+          <w:rFonts w:ascii="Century Gothic" w:hAnsi="Century Gothic"/>
+        </w:rPr>
+      </w:pPr>
+      <w:r>
+        <w:rPr>
+          <w:rFonts w:ascii="Century Gothic" w:hAnsi="Century Gothic"/>
+        </w:rPr>
+        <w:t>Deployment (Docker):</w:t>
+      </w:r>
+    </w:p>
+    <w:p>
+      <w:pPr>
+        <w:rPr>
+          <w:rFonts w:ascii="Century Gothic" w:hAnsi="Century Gothic"/>
+        </w:rPr>
+      </w:pPr>
+    </w:p>
+    <w:p>
+      <w:pPr>
+        <w:rPr>
+          <w:rFonts w:ascii="Century Gothic" w:hAnsi="Century Gothic"/>
+        </w:rPr>
+      </w:pPr>
+      <w:r>
+        <w:rPr>
+          <w:rFonts w:ascii="Century Gothic" w:hAnsi="Century Gothic"/>
+        </w:rPr>
+        <w:t xml:space="preserve">Step 1: </w:t>
+      </w:r>
+      <w:proofErr w:type="spellStart"/>
+      <w:r>
+        <w:rPr>
+          <w:rFonts w:ascii="Century Gothic" w:hAnsi="Century Gothic"/>
+        </w:rPr>
+        <w:t>docker</w:t>
+      </w:r>
+      <w:proofErr w:type="spellEnd"/>
+      <w:r>
+        <w:rPr>
+          <w:rFonts w:ascii="Century Gothic" w:hAnsi="Century Gothic"/>
+        </w:rPr>
+        <w:t>-compose build</w:t>
+      </w:r>
+    </w:p>
+    <w:p>
+      <w:pPr>
+        <w:rPr>
+          <w:rFonts w:ascii="Century Gothic" w:hAnsi="Century Gothic"/>
+        </w:rPr>
+      </w:pPr>
+      <w:r>
+        <w:rPr>
+          <w:rFonts w:ascii="Century Gothic" w:hAnsi="Century Gothic"/>
+        </w:rPr>
+        <w:t xml:space="preserve">Step 2: </w:t>
+      </w:r>
+      <w:proofErr w:type="spellStart"/>
+      <w:r>
+        <w:rPr>
+          <w:rFonts w:ascii="Century Gothic" w:hAnsi="Century Gothic"/>
+        </w:rPr>
+        <w:t>docker</w:t>
+      </w:r>
+      <w:proofErr w:type="spellEnd"/>
+      <w:r>
+        <w:rPr>
+          <w:rFonts w:ascii="Century Gothic" w:hAnsi="Century Gothic"/>
+        </w:rPr>
+        <w:t>-compose up -d</w:t>
+      </w:r>
+    </w:p>
+    <w:p>
+      <w:pPr>
+        <w:rPr>
+          <w:rFonts w:ascii="Century Gothic" w:hAnsi="Century Gothic"/>
+        </w:rPr>
+      </w:pPr>
+      <w:r>
+        <w:rPr>
+          <w:rFonts w:ascii="Century Gothic" w:hAnsi="Century Gothic"/>
+        </w:rPr>
+        <w:t>Step 3: Open http://localhost:8501</w:t>
+      </w:r>
+    </w:p>
+    <w:p>
+      <w:pPr>
+        <w:rPr>
+          <w:rFonts w:ascii="Century Gothic" w:hAnsi="Century Gothic"/>
+        </w:rPr>
+      </w:pPr>
+    </w:p>
+    <w:p>
+      <w:pPr>
+        <w:rPr>
+          <w:rFonts w:ascii="Century Gothic" w:hAnsi="Century Gothic"/>
+        </w:rPr>
+      </w:pPr>
+      <w:r>
+        <w:rPr>
+          <w:rFonts w:ascii="Century Gothic" w:hAnsi="Century Gothic"/>
+        </w:rPr>
+        <w:t>API Endpoint:</w:t>
+      </w:r>
+    </w:p>
+    <w:p>
+      <w:pPr>
+        <w:rPr>
+          <w:rFonts w:ascii="Century Gothic" w:hAnsi="Century Gothic"/>
+        </w:rPr>
+      </w:pPr>
+      <w:r>
+        <w:rPr>
+          <w:rFonts w:ascii="Century Gothic" w:hAnsi="Century Gothic"/>
+        </w:rPr>
+        <w:t>POST /predict</w:t>
+      </w:r>
+    </w:p>
+    <w:p>
+      <w:pPr>
+        <w:rPr>
+          <w:rFonts w:ascii="Century Gothic" w:hAnsi="Century Gothic"/>
+        </w:rPr>
+      </w:pPr>
+      <w:r>
+        <w:rPr>
+          <w:rFonts w:ascii="Century Gothic" w:hAnsi="Century Gothic"/>
+        </w:rPr>
+        <w:t>Content-Type: application/</w:t>
+      </w:r>
+      <w:proofErr w:type="spellStart"/>
+      <w:r>
+        <w:rPr>
+          <w:rFonts w:ascii="Century Gothic" w:hAnsi="Century Gothic"/>
+        </w:rPr>
+        <w:t>json</w:t>
+      </w:r>
+      <w:proofErr w:type="spellEnd"/>
+    </w:p>
+    <w:p>
+      <w:pPr>
+        <w:rPr>
+          <w:rFonts w:ascii="Century Gothic" w:hAnsi="Century Gothic"/>
+        </w:rPr>
+      </w:pPr>
+    </w:p>
+    <w:p>
+      <w:pPr>
+        <w:rPr>
+          <w:rFonts w:ascii="Century Gothic" w:hAnsi="Century Gothic"/>
+        </w:rPr>
+      </w:pPr>
+      <w:r>
+        <w:rPr>
+          <w:rFonts w:ascii="Century Gothic" w:hAnsi="Century Gothic"/>
+        </w:rPr>
+        <w:t>Request Body:</w:t>
+      </w:r>
+    </w:p>
+    <w:p>
+      <w:pPr>
+        <w:rPr>
+          <w:rFonts w:ascii="Century Gothic" w:hAnsi="Century Gothic"/>
+        </w:rPr>
+      </w:pPr>
+      <w:r>
+        <w:rPr>
+          <w:rFonts w:ascii="Century Gothic" w:hAnsi="Century Gothic"/>
+        </w:rPr>
+        <w:t>{</w:t>
+      </w:r>
+    </w:p>
+    <w:p>
+      <w:pPr>
+        <w:rPr>
+          <w:rFonts w:ascii="Century Gothic" w:hAnsi="Century Gothic"/>
+        </w:rPr>
+      </w:pPr>
+      <w:r>
+        <w:rPr>
+          <w:rFonts w:ascii="Century Gothic" w:hAnsi="Century Gothic"/>
+        </w:rPr>
+        <w:t xml:space="preserve">    "</w:t>
+      </w:r>
+      <w:proofErr w:type="spellStart"/>
+      <w:r>
+        <w:rPr>
+          <w:rFonts w:ascii="Century Gothic" w:hAnsi="Century Gothic"/>
+        </w:rPr>
+        <w:t>ndvi</w:t>
+      </w:r>
+      <w:proofErr w:type="spellEnd"/>
+      <w:r>
+        <w:rPr>
+          <w:rFonts w:ascii="Century Gothic" w:hAnsi="Century Gothic"/>
+        </w:rPr>
+        <w:t>": 0.60,</w:t>
+      </w:r>
+    </w:p>
+    <w:p>
+      <w:pPr>
+        <w:rPr>
+          <w:rFonts w:ascii="Century Gothic" w:hAnsi="Century Gothic"/>
+        </w:rPr>
+      </w:pPr>
+      <w:r>
+        <w:rPr>
+          <w:rFonts w:ascii="Century Gothic" w:hAnsi="Century Gothic"/>
+        </w:rPr>
+        <w:t xml:space="preserve">    "precipitation": 600,</w:t>
+      </w:r>
+    </w:p>
+    <w:p>
+      <w:pPr>
+        <w:rPr>
+          <w:rFonts w:ascii="Century Gothic" w:hAnsi="Century Gothic"/>
+        </w:rPr>
+      </w:pPr>
+      <w:r>
+        <w:rPr>
+          <w:rFonts w:ascii="Century Gothic" w:hAnsi="Century Gothic"/>
+        </w:rPr>
+        <w:t xml:space="preserve">    "temperature": 17,</w:t>
+      </w:r>
+    </w:p>
+    <w:p>
+      <w:pPr>
+        <w:rPr>
+          <w:rFonts w:ascii="Century Gothic" w:hAnsi="Century Gothic"/>
+        </w:rPr>
+      </w:pPr>
+      <w:r>
+        <w:rPr>
+          <w:rFonts w:ascii="Century Gothic" w:hAnsi="Century Gothic"/>
+        </w:rPr>
+        <w:t xml:space="preserve">    "elevation": 300,</w:t>
+      </w:r>
+    </w:p>
+    <w:p>
+      <w:pPr>
+        <w:rPr>
+          <w:rFonts w:ascii="Century Gothic" w:hAnsi="Century Gothic"/>
+        </w:rPr>
+      </w:pPr>
+      <w:r>
+        <w:rPr>
+          <w:rFonts w:ascii="Century Gothic" w:hAnsi="Century Gothic"/>
+        </w:rPr>
+        <w:t xml:space="preserve">    "clay": 25</w:t>
+      </w:r>
+    </w:p>
+    <w:p>
+      <w:pPr>
+        <w:rPr>
+          <w:rFonts w:ascii="Century Gothic" w:hAnsi="Century Gothic"/>
+        </w:rPr>
+      </w:pPr>
+      <w:r>
+        <w:rPr>
+          <w:rFonts w:ascii="Century Gothic" w:hAnsi="Century Gothic"/>
+        </w:rPr>
+        <w:t>}</w:t>
+      </w:r>
+    </w:p>
+    <w:p>
+      <w:pPr>
+        <w:rPr>
+          <w:rFonts w:ascii="Century Gothic" w:hAnsi="Century Gothic"/>
+        </w:rPr>
+      </w:pPr>
+    </w:p>
+    <w:p>
+      <w:pPr>
+        <w:rPr>
+          <w:rFonts w:ascii="Century Gothic" w:hAnsi="Century Gothic"/>
+        </w:rPr>
+      </w:pPr>
+      <w:r>
+        <w:rPr>
+          <w:rFonts w:ascii="Century Gothic" w:hAnsi="Century Gothic"/>
+        </w:rPr>
+        <w:t>Response:</w:t>
+      </w:r>
+    </w:p>
+    <w:p>
+      <w:pPr>
+        <w:rPr>
+          <w:rFonts w:ascii="Century Gothic" w:hAnsi="Century Gothic"/>
+        </w:rPr>
+      </w:pPr>
+      <w:r>
+        <w:rPr>
+          <w:rFonts w:ascii="Century Gothic" w:hAnsi="Century Gothic"/>
+        </w:rPr>
+        <w:t>{</w:t>
+      </w:r>
+    </w:p>
+    <w:p>
+      <w:pPr>
+        <w:rPr>
+          <w:rFonts w:ascii="Century Gothic" w:hAnsi="Century Gothic"/>
+        </w:rPr>
+      </w:pPr>
+      <w:r>
+        <w:rPr>
+          <w:rFonts w:ascii="Century Gothic" w:hAnsi="Century Gothic"/>
+        </w:rPr>
+        <w:t xml:space="preserve">    "</w:t>
+      </w:r>
+      <w:proofErr w:type="spellStart"/>
+      <w:r>
+        <w:rPr>
+          <w:rFonts w:ascii="Century Gothic" w:hAnsi="Century Gothic"/>
+        </w:rPr>
+        <w:t>predicted_soc_percent</w:t>
+      </w:r>
+      <w:proofErr w:type="spellEnd"/>
+      <w:r>
+        <w:rPr>
+          <w:rFonts w:ascii="Century Gothic" w:hAnsi="Century Gothic"/>
+        </w:rPr>
+        <w:t>": 5.64</w:t>
+      </w:r>
+    </w:p>
+    <w:p>
+      <w:pPr>
+        <w:rPr>
+          <w:rFonts w:ascii="Century Gothic" w:hAnsi="Century Gothic"/>
+        </w:rPr>
+      </w:pPr>
+      <w:r>
+        <w:rPr>
+          <w:rFonts w:ascii="Century Gothic" w:hAnsi="Century Gothic"/>
+        </w:rPr>
+        <w:t>}</w:t>
+      </w:r>
+    </w:p>
+    <w:p>
+      <w:pPr>
+        <w:rPr>
+          <w:rFonts w:ascii="Century Gothic" w:hAnsi="Century Gothic"/>
+        </w:rPr>
+      </w:pPr>
+    </w:p>
+    <w:p>
+      <w:pPr>
+        <w:rPr>
+          <w:rFonts w:ascii="Century Gothic" w:hAnsi="Century Gothic"/>
+        </w:rPr>
+      </w:pPr>
+      <w:r>
+        <w:rPr>
+          <w:rFonts w:ascii="Century Gothic" w:hAnsi="Century Gothic"/>
+        </w:rPr>
+        <w:t>Dependencies:</w:t>
+      </w:r>
+    </w:p>
+    <w:p>
+      <w:pPr>
+        <w:rPr>
+          <w:rFonts w:ascii="Century Gothic" w:hAnsi="Century Gothic"/>
+        </w:rPr>
+      </w:pPr>
+      <w:r>
+        <w:rPr>
+          <w:rFonts w:ascii="Century Gothic" w:hAnsi="Century Gothic"/>
+        </w:rPr>
+        <w:t>• Python 3.9+</w:t>
+      </w:r>
+    </w:p>
+    <w:p>
+      <w:pPr>
+        <w:rPr>
+          <w:rFonts w:ascii="Century Gothic" w:hAnsi="Century Gothic"/>
+        </w:rPr>
+      </w:pPr>
+      <w:r>
+        <w:rPr>
+          <w:rFonts w:ascii="Century Gothic" w:hAnsi="Century Gothic"/>
+        </w:rPr>
+        <w:t xml:space="preserve">• </w:t>
+      </w:r>
+      <w:proofErr w:type="spellStart"/>
+      <w:r>
+        <w:rPr>
+          <w:rFonts w:ascii="Century Gothic" w:hAnsi="Century Gothic"/>
+        </w:rPr>
+        <w:t>FastAPI</w:t>
+      </w:r>
+      <w:proofErr w:type="spellEnd"/>
+      <w:r>
+        <w:rPr>
+          <w:rFonts w:ascii="Century Gothic" w:hAnsi="Century Gothic"/>
+        </w:rPr>
+        <w:t xml:space="preserve">, </w:t>
+      </w:r>
+      <w:proofErr w:type="spellStart"/>
+      <w:r>
+        <w:rPr>
+          <w:rFonts w:ascii="Century Gothic" w:hAnsi="Century Gothic"/>
+        </w:rPr>
         <w:t>Streamlit</w:t>
       </w:r>
       <w:proofErr w:type="spellEnd"/>
@@ -1277,455 +2207,20 @@
         <w:rPr>
           <w:rFonts w:ascii="Century Gothic" w:hAnsi="Century Gothic"/>
         </w:rPr>
-        <w:t xml:space="preserve"> Dashboard] → [</w:t>
+        <w:t xml:space="preserve">, </w:t>
       </w:r>
       <w:proofErr w:type="spellStart"/>
       <w:r>
         <w:rPr>
           <w:rFonts w:ascii="Century Gothic" w:hAnsi="Century Gothic"/>
         </w:rPr>
-        <w:t>FastAPI</w:t>
+        <w:t>scikit</w:t>
       </w:r>
       <w:proofErr w:type="spellEnd"/>
       <w:r>
         <w:rPr>
           <w:rFonts w:ascii="Century Gothic" w:hAnsi="Century Gothic"/>
         </w:rPr>
-        <w:t>] → [Random Forest Model] → [SOC% + Carbon Credits]</w:t>
-      </w:r>
-    </w:p>
-    <w:p>
-      <w:pPr>
-        <w:rPr>
-          <w:rFonts w:ascii="Century Gothic" w:hAnsi="Century Gothic"/>
-        </w:rPr>
-      </w:pPr>
-    </w:p>
-    <w:p>
-      <w:pPr>
-        <w:rPr>
-          <w:rFonts w:ascii="Century Gothic" w:hAnsi="Century Gothic"/>
-        </w:rPr>
-      </w:pPr>
-      <w:r>
-        <w:rPr>
-          <w:rFonts w:ascii="Century Gothic" w:hAnsi="Century Gothic"/>
-        </w:rPr>
-        <w:t>Deployment (Docker):</w:t>
-      </w:r>
-    </w:p>
-    <w:p>
-      <w:pPr>
-        <w:rPr>
-          <w:rFonts w:ascii="Century Gothic" w:hAnsi="Century Gothic"/>
-        </w:rPr>
-      </w:pPr>
-    </w:p>
-    <w:p>
-      <w:pPr>
-        <w:rPr>
-          <w:rFonts w:ascii="Century Gothic" w:hAnsi="Century Gothic"/>
-        </w:rPr>
-      </w:pPr>
-      <w:r>
-        <w:rPr>
-          <w:rFonts w:ascii="Century Gothic" w:hAnsi="Century Gothic"/>
-        </w:rPr>
-        <w:t xml:space="preserve">Step 1: </w:t>
-      </w:r>
-      <w:proofErr w:type="spellStart"/>
-      <w:r>
-        <w:rPr>
-          <w:rFonts w:ascii="Century Gothic" w:hAnsi="Century Gothic"/>
-        </w:rPr>
-        <w:t>docker</w:t>
-      </w:r>
-      <w:proofErr w:type="spellEnd"/>
-      <w:r>
-        <w:rPr>
-          <w:rFonts w:ascii="Century Gothic" w:hAnsi="Century Gothic"/>
-        </w:rPr>
-        <w:t>-compose build</w:t>
-      </w:r>
-    </w:p>
-    <w:p>
-      <w:pPr>
-        <w:rPr>
-          <w:rFonts w:ascii="Century Gothic" w:hAnsi="Century Gothic"/>
-        </w:rPr>
-      </w:pPr>
-      <w:r>
-        <w:rPr>
-          <w:rFonts w:ascii="Century Gothic" w:hAnsi="Century Gothic"/>
-        </w:rPr>
-        <w:t xml:space="preserve">Step 2: </w:t>
-      </w:r>
-      <w:proofErr w:type="spellStart"/>
-      <w:r>
-        <w:rPr>
-          <w:rFonts w:ascii="Century Gothic" w:hAnsi="Century Gothic"/>
-        </w:rPr>
-        <w:t>docker</w:t>
-      </w:r>
-      <w:proofErr w:type="spellEnd"/>
-      <w:r>
-        <w:rPr>
-          <w:rFonts w:ascii="Century Gothic" w:hAnsi="Century Gothic"/>
-        </w:rPr>
-        <w:t>-compose up -d</w:t>
-      </w:r>
-    </w:p>
-    <w:p>
-      <w:pPr>
-        <w:rPr>
-          <w:rFonts w:ascii="Century Gothic" w:hAnsi="Century Gothic"/>
-        </w:rPr>
-      </w:pPr>
-      <w:r>
-        <w:rPr>
-          <w:rFonts w:ascii="Century Gothic" w:hAnsi="Century Gothic"/>
-        </w:rPr>
-        <w:t>Step 3: Open http://localhost:8501</w:t>
-      </w:r>
-    </w:p>
-    <w:p>
-      <w:pPr>
-        <w:rPr>
-          <w:rFonts w:ascii="Century Gothic" w:hAnsi="Century Gothic"/>
-        </w:rPr>
-      </w:pPr>
-    </w:p>
-    <w:p>
-      <w:pPr>
-        <w:rPr>
-          <w:rFonts w:ascii="Century Gothic" w:hAnsi="Century Gothic"/>
-        </w:rPr>
-      </w:pPr>
-      <w:r>
-        <w:rPr>
-          <w:rFonts w:ascii="Century Gothic" w:hAnsi="Century Gothic"/>
-        </w:rPr>
-        <w:t>API Endpoint:</w:t>
-      </w:r>
-    </w:p>
-    <w:p>
-      <w:pPr>
-        <w:rPr>
-          <w:rFonts w:ascii="Century Gothic" w:hAnsi="Century Gothic"/>
-        </w:rPr>
-      </w:pPr>
-      <w:r>
-        <w:rPr>
-          <w:rFonts w:ascii="Century Gothic" w:hAnsi="Century Gothic"/>
-        </w:rPr>
-        <w:t>POST /predict</w:t>
-      </w:r>
-    </w:p>
-    <w:p>
-      <w:pPr>
-        <w:rPr>
-          <w:rFonts w:ascii="Century Gothic" w:hAnsi="Century Gothic"/>
-        </w:rPr>
-      </w:pPr>
-      <w:r>
-        <w:rPr>
-          <w:rFonts w:ascii="Century Gothic" w:hAnsi="Century Gothic"/>
-        </w:rPr>
-        <w:t>Content-Type: application/</w:t>
-      </w:r>
-      <w:proofErr w:type="spellStart"/>
-      <w:r>
-        <w:rPr>
-          <w:rFonts w:ascii="Century Gothic" w:hAnsi="Century Gothic"/>
-        </w:rPr>
-        <w:t>json</w:t>
-      </w:r>
-      <w:proofErr w:type="spellEnd"/>
-    </w:p>
-    <w:p>
-      <w:pPr>
-        <w:rPr>
-          <w:rFonts w:ascii="Century Gothic" w:hAnsi="Century Gothic"/>
-        </w:rPr>
-      </w:pPr>
-    </w:p>
-    <w:p>
-      <w:pPr>
-        <w:rPr>
-          <w:rFonts w:ascii="Century Gothic" w:hAnsi="Century Gothic"/>
-        </w:rPr>
-      </w:pPr>
-      <w:r>
-        <w:rPr>
-          <w:rFonts w:ascii="Century Gothic" w:hAnsi="Century Gothic"/>
-        </w:rPr>
-        <w:t>Request Body:</w:t>
-      </w:r>
-    </w:p>
-    <w:p>
-      <w:pPr>
-        <w:rPr>
-          <w:rFonts w:ascii="Century Gothic" w:hAnsi="Century Gothic"/>
-        </w:rPr>
-      </w:pPr>
-      <w:r>
-        <w:rPr>
-          <w:rFonts w:ascii="Century Gothic" w:hAnsi="Century Gothic"/>
-        </w:rPr>
-        <w:t>{</w:t>
-      </w:r>
-    </w:p>
-    <w:p>
-      <w:pPr>
-        <w:rPr>
-          <w:rFonts w:ascii="Century Gothic" w:hAnsi="Century Gothic"/>
-        </w:rPr>
-      </w:pPr>
-      <w:r>
-        <w:rPr>
-          <w:rFonts w:ascii="Century Gothic" w:hAnsi="Century Gothic"/>
-        </w:rPr>
-        <w:t xml:space="preserve">    "</w:t>
-      </w:r>
-      <w:proofErr w:type="spellStart"/>
-      <w:r>
-        <w:rPr>
-          <w:rFonts w:ascii="Century Gothic" w:hAnsi="Century Gothic"/>
-        </w:rPr>
-        <w:t>ndvi</w:t>
-      </w:r>
-      <w:proofErr w:type="spellEnd"/>
-      <w:r>
-        <w:rPr>
-          <w:rFonts w:ascii="Century Gothic" w:hAnsi="Century Gothic"/>
-        </w:rPr>
-        <w:t>": 0.60,</w:t>
-      </w:r>
-    </w:p>
-    <w:p>
-      <w:pPr>
-        <w:rPr>
-          <w:rFonts w:ascii="Century Gothic" w:hAnsi="Century Gothic"/>
-        </w:rPr>
-      </w:pPr>
-      <w:r>
-        <w:rPr>
-          <w:rFonts w:ascii="Century Gothic" w:hAnsi="Century Gothic"/>
-        </w:rPr>
-        <w:t xml:space="preserve">    "precipitation": 600,</w:t>
-      </w:r>
-    </w:p>
-    <w:p>
-      <w:pPr>
-        <w:rPr>
-          <w:rFonts w:ascii="Century Gothic" w:hAnsi="Century Gothic"/>
-        </w:rPr>
-      </w:pPr>
-      <w:r>
-        <w:rPr>
-          <w:rFonts w:ascii="Century Gothic" w:hAnsi="Century Gothic"/>
-        </w:rPr>
-        <w:t xml:space="preserve">    "temperature": 17,</w:t>
-      </w:r>
-    </w:p>
-    <w:p>
-      <w:pPr>
-        <w:rPr>
-          <w:rFonts w:ascii="Century Gothic" w:hAnsi="Century Gothic"/>
-        </w:rPr>
-      </w:pPr>
-      <w:r>
-        <w:rPr>
-          <w:rFonts w:ascii="Century Gothic" w:hAnsi="Century Gothic"/>
-        </w:rPr>
-        <w:t xml:space="preserve">    "elevation": 300,</w:t>
-      </w:r>
-    </w:p>
-    <w:p>
-      <w:pPr>
-        <w:rPr>
-          <w:rFonts w:ascii="Century Gothic" w:hAnsi="Century Gothic"/>
-        </w:rPr>
-      </w:pPr>
-      <w:r>
-        <w:rPr>
-          <w:rFonts w:ascii="Century Gothic" w:hAnsi="Century Gothic"/>
-        </w:rPr>
-        <w:t xml:space="preserve">    "clay": 25</w:t>
-      </w:r>
-    </w:p>
-    <w:p>
-      <w:pPr>
-        <w:rPr>
-          <w:rFonts w:ascii="Century Gothic" w:hAnsi="Century Gothic"/>
-        </w:rPr>
-      </w:pPr>
-      <w:r>
-        <w:rPr>
-          <w:rFonts w:ascii="Century Gothic" w:hAnsi="Century Gothic"/>
-        </w:rPr>
-        <w:t>}</w:t>
-      </w:r>
-    </w:p>
-    <w:p>
-      <w:pPr>
-        <w:rPr>
-          <w:rFonts w:ascii="Century Gothic" w:hAnsi="Century Gothic"/>
-        </w:rPr>
-      </w:pPr>
-    </w:p>
-    <w:p>
-      <w:pPr>
-        <w:rPr>
-          <w:rFonts w:ascii="Century Gothic" w:hAnsi="Century Gothic"/>
-        </w:rPr>
-      </w:pPr>
-      <w:r>
-        <w:rPr>
-          <w:rFonts w:ascii="Century Gothic" w:hAnsi="Century Gothic"/>
-        </w:rPr>
-        <w:t>Response:</w:t>
-      </w:r>
-    </w:p>
-    <w:p>
-      <w:pPr>
-        <w:rPr>
-          <w:rFonts w:ascii="Century Gothic" w:hAnsi="Century Gothic"/>
-        </w:rPr>
-      </w:pPr>
-      <w:r>
-        <w:rPr>
-          <w:rFonts w:ascii="Century Gothic" w:hAnsi="Century Gothic"/>
-        </w:rPr>
-        <w:t>{</w:t>
-      </w:r>
-    </w:p>
-    <w:p>
-      <w:pPr>
-        <w:rPr>
-          <w:rFonts w:ascii="Century Gothic" w:hAnsi="Century Gothic"/>
-        </w:rPr>
-      </w:pPr>
-      <w:r>
-        <w:rPr>
-          <w:rFonts w:ascii="Century Gothic" w:hAnsi="Century Gothic"/>
-        </w:rPr>
-        <w:t xml:space="preserve">    "</w:t>
-      </w:r>
-      <w:proofErr w:type="spellStart"/>
-      <w:r>
-        <w:rPr>
-          <w:rFonts w:ascii="Century Gothic" w:hAnsi="Century Gothic"/>
-        </w:rPr>
-        <w:t>predicted_soc_percent</w:t>
-      </w:r>
-      <w:proofErr w:type="spellEnd"/>
-      <w:r>
-        <w:rPr>
-          <w:rFonts w:ascii="Century Gothic" w:hAnsi="Century Gothic"/>
-        </w:rPr>
-        <w:t>": 5.64</w:t>
-      </w:r>
-    </w:p>
-    <w:p>
-      <w:pPr>
-        <w:rPr>
-          <w:rFonts w:ascii="Century Gothic" w:hAnsi="Century Gothic"/>
-        </w:rPr>
-      </w:pPr>
-      <w:r>
-        <w:rPr>
-          <w:rFonts w:ascii="Century Gothic" w:hAnsi="Century Gothic"/>
-        </w:rPr>
-        <w:t>}</w:t>
-      </w:r>
-    </w:p>
-    <w:p>
-      <w:pPr>
-        <w:rPr>
-          <w:rFonts w:ascii="Century Gothic" w:hAnsi="Century Gothic"/>
-        </w:rPr>
-      </w:pPr>
-    </w:p>
-    <w:p>
-      <w:pPr>
-        <w:rPr>
-          <w:rFonts w:ascii="Century Gothic" w:hAnsi="Century Gothic"/>
-        </w:rPr>
-      </w:pPr>
-      <w:r>
-        <w:rPr>
-          <w:rFonts w:ascii="Century Gothic" w:hAnsi="Century Gothic"/>
-        </w:rPr>
-        <w:lastRenderedPageBreak/>
-        <w:t>Dependencies:</w:t>
-      </w:r>
-    </w:p>
-    <w:p>
-      <w:pPr>
-        <w:rPr>
-          <w:rFonts w:ascii="Century Gothic" w:hAnsi="Century Gothic"/>
-        </w:rPr>
-      </w:pPr>
-      <w:r>
-        <w:rPr>
-          <w:rFonts w:ascii="Century Gothic" w:hAnsi="Century Gothic"/>
-        </w:rPr>
-        <w:t>• Python 3.9+</w:t>
-      </w:r>
-    </w:p>
-    <w:p>
-      <w:pPr>
-        <w:rPr>
-          <w:rFonts w:ascii="Century Gothic" w:hAnsi="Century Gothic"/>
-        </w:rPr>
-      </w:pPr>
-      <w:r>
-        <w:rPr>
-          <w:rFonts w:ascii="Century Gothic" w:hAnsi="Century Gothic"/>
-        </w:rPr>
-        <w:t xml:space="preserve">• </w:t>
-      </w:r>
-      <w:proofErr w:type="spellStart"/>
-      <w:r>
-        <w:rPr>
-          <w:rFonts w:ascii="Century Gothic" w:hAnsi="Century Gothic"/>
-        </w:rPr>
-        <w:t>FastAPI</w:t>
-      </w:r>
-      <w:proofErr w:type="spellEnd"/>
-      <w:r>
-        <w:rPr>
-          <w:rFonts w:ascii="Century Gothic" w:hAnsi="Century Gothic"/>
-        </w:rPr>
-        <w:t xml:space="preserve">, </w:t>
-      </w:r>
-      <w:proofErr w:type="spellStart"/>
-      <w:r>
-        <w:rPr>
-          <w:rFonts w:ascii="Century Gothic" w:hAnsi="Century Gothic"/>
-        </w:rPr>
-        <w:t>Streamlit</w:t>
-      </w:r>
-      <w:proofErr w:type="spellEnd"/>
-      <w:r>
-        <w:rPr>
-          <w:rFonts w:ascii="Century Gothic" w:hAnsi="Century Gothic"/>
-        </w:rPr>
-        <w:t xml:space="preserve">, </w:t>
-      </w:r>
-      <w:proofErr w:type="spellStart"/>
-      <w:r>
-        <w:rPr>
-          <w:rFonts w:ascii="Century Gothic" w:hAnsi="Century Gothic"/>
-        </w:rPr>
-        <w:t>scikit</w:t>
-      </w:r>
-      <w:proofErr w:type="spellEnd"/>
-      <w:r>
-        <w:rPr>
-          <w:rFonts w:ascii="Century Gothic" w:hAnsi="Century Gothic"/>
-        </w:rPr>
         <w:t>-learn</w:t>
       </w:r>
     </w:p>
@@ -1772,7 +2267,13 @@
         <w:rPr>
           <w:rFonts w:ascii="Century Gothic" w:hAnsi="Century Gothic"/>
         </w:rPr>
-        <w:t>• Email: varia.agtech@gmail.com</w:t>
+        <w:t xml:space="preserve">• Email: </w:t>
+      </w:r>
+      <w:r>
+        <w:rPr>
+          <w:rFonts w:ascii="Century Gothic" w:hAnsi="Century Gothic"/>
+        </w:rPr>
+        <w:t>Mah.kzmi21@gmail.com</w:t>
       </w:r>
     </w:p>
     <w:p>
@@ -1794,8 +2295,6 @@
           <w:rFonts w:ascii="Century Gothic" w:hAnsi="Century Gothic"/>
         </w:rPr>
       </w:pPr>
-      <w:bookmarkStart w:id="0" w:name="_GoBack"/>
-      <w:bookmarkEnd w:id="0"/>
     </w:p>
     <w:sectPr>
       <w:pgSz w:w="12240" w:h="15840"/>
@@ -2228,6 +2727,112 @@
     <w:semiHidden/>
     <w:unhideWhenUsed/>
   </w:style>
+  <w:style w:type="character" w:styleId="Hyperlink">
+    <w:name w:val="Hyperlink"/>
+    <w:basedOn w:val="DefaultParagraphFont"/>
+    <w:uiPriority w:val="99"/>
+    <w:unhideWhenUsed/>
+    <w:rsid w:val="00931976"/>
+    <w:rPr>
+      <w:color w:val="0563C1" w:themeColor="hyperlink"/>
+      <w:u w:val="single"/>
+    </w:rPr>
+  </w:style>
+  <w:style w:type="table" w:styleId="TableGrid">
+    <w:name w:val="Table Grid"/>
+    <w:basedOn w:val="TableNormal"/>
+    <w:uiPriority w:val="39"/>
+    <w:rsid w:val="00931976"/>
+    <w:pPr>
+      <w:spacing w:after="0" w:line="240" w:lineRule="auto"/>
+    </w:pPr>
+    <w:tblPr>
+      <w:tblBorders>
+        <w:top w:val="single" w:sz="4" w:space="0" w:color="auto"/>
+        <w:left w:val="single" w:sz="4" w:space="0" w:color="auto"/>
+        <w:bottom w:val="single" w:sz="4" w:space="0" w:color="auto"/>
+        <w:right w:val="single" w:sz="4" w:space="0" w:color="auto"/>
+        <w:insideH w:val="single" w:sz="4" w:space="0" w:color="auto"/>
+        <w:insideV w:val="single" w:sz="4" w:space="0" w:color="auto"/>
+      </w:tblBorders>
+    </w:tblPr>
+  </w:style>
+  <w:style w:type="table" w:styleId="GridTable4-Accent6">
+    <w:name w:val="Grid Table 4 Accent 6"/>
+    <w:basedOn w:val="TableNormal"/>
+    <w:uiPriority w:val="49"/>
+    <w:rsid w:val="00931976"/>
+    <w:pPr>
+      <w:spacing w:after="0" w:line="240" w:lineRule="auto"/>
+    </w:pPr>
+    <w:tblPr>
+      <w:tblStyleRowBandSize w:val="1"/>
+      <w:tblStyleColBandSize w:val="1"/>
+      <w:tblBorders>
+        <w:top w:val="single" w:sz="4" w:space="0" w:color="A8D08D" w:themeColor="accent6" w:themeTint="99"/>
+        <w:left w:val="single" w:sz="4" w:space="0" w:color="A8D08D" w:themeColor="accent6" w:themeTint="99"/>
+        <w:bottom w:val="single" w:sz="4" w:space="0" w:color="A8D08D" w:themeColor="accent6" w:themeTint="99"/>
+        <w:right w:val="single" w:sz="4" w:space="0" w:color="A8D08D" w:themeColor="accent6" w:themeTint="99"/>
+        <w:insideH w:val="single" w:sz="4" w:space="0" w:color="A8D08D" w:themeColor="accent6" w:themeTint="99"/>
+        <w:insideV w:val="single" w:sz="4" w:space="0" w:color="A8D08D" w:themeColor="accent6" w:themeTint="99"/>
+      </w:tblBorders>
+    </w:tblPr>
+    <w:tblStylePr w:type="firstRow">
+      <w:rPr>
+        <w:b/>
+        <w:bCs/>
+        <w:color w:val="FFFFFF" w:themeColor="background1"/>
+      </w:rPr>
+      <w:tblPr/>
+      <w:tcPr>
+        <w:tcBorders>
+          <w:top w:val="single" w:sz="4" w:space="0" w:color="70AD47" w:themeColor="accent6"/>
+          <w:left w:val="single" w:sz="4" w:space="0" w:color="70AD47" w:themeColor="accent6"/>
+          <w:bottom w:val="single" w:sz="4" w:space="0" w:color="70AD47" w:themeColor="accent6"/>
+          <w:right w:val="single" w:sz="4" w:space="0" w:color="70AD47" w:themeColor="accent6"/>
+          <w:insideH w:val="nil"/>
+          <w:insideV w:val="nil"/>
+        </w:tcBorders>
+        <w:shd w:val="clear" w:color="auto" w:fill="70AD47" w:themeFill="accent6"/>
+      </w:tcPr>
+    </w:tblStylePr>
+    <w:tblStylePr w:type="lastRow">
+      <w:rPr>
+        <w:b/>
+        <w:bCs/>
+      </w:rPr>
+      <w:tblPr/>
+      <w:tcPr>
+        <w:tcBorders>
+          <w:top w:val="double" w:sz="4" w:space="0" w:color="70AD47" w:themeColor="accent6"/>
+        </w:tcBorders>
+      </w:tcPr>
+    </w:tblStylePr>
+    <w:tblStylePr w:type="firstCol">
+      <w:rPr>
+        <w:b/>
+        <w:bCs/>
+      </w:rPr>
+    </w:tblStylePr>
+    <w:tblStylePr w:type="lastCol">
+      <w:rPr>
+        <w:b/>
+        <w:bCs/>
+      </w:rPr>
+    </w:tblStylePr>
+    <w:tblStylePr w:type="band1Vert">
+      <w:tblPr/>
+      <w:tcPr>
+        <w:shd w:val="clear" w:color="auto" w:fill="E2EFD9" w:themeFill="accent6" w:themeFillTint="33"/>
+      </w:tcPr>
+    </w:tblStylePr>
+    <w:tblStylePr w:type="band1Horz">
+      <w:tblPr/>
+      <w:tcPr>
+        <w:shd w:val="clear" w:color="auto" w:fill="E2EFD9" w:themeFill="accent6" w:themeFillTint="33"/>
+      </w:tcPr>
+    </w:tblStylePr>
+  </w:style>
 </w:styles>
 </file>
 

</xml_diff>